<commit_message>
Cambio en carpeta con archivos dentro del repo
</commit_message>
<xml_diff>
--- a/ayudaaaa/Siuu.docx
+++ b/ayudaaaa/Siuu.docx
@@ -12,8 +12,16 @@
         <w:rPr>
           <w:lang w:val="es-ES"/>
         </w:rPr>
-        <w:t>Cambio local</w:t>
+        <w:t>Voy a hacer este cambio</w:t>
       </w:r>
+    </w:p>
+    <w:p>
+      <w:pPr>
+        <w:rPr>
+          <w:u w:val="single"/>
+          <w:lang w:val="es-ES"/>
+        </w:rPr>
+      </w:pPr>
     </w:p>
     <w:sectPr>
       <w:pgSz w:w="12240" w:h="15840"/>

</xml_diff>